<commit_message>
Update Ke hoach to chuyen mon THCS, TKB, LBG va Phan phoi chuong trinh
</commit_message>
<xml_diff>
--- a/Hệ thống mẫu văn bản/Khung  giáo án Unigo 2026-2027 Thang 7.2026.docx
+++ b/Hệ thống mẫu văn bản/Khung  giáo án Unigo 2026-2027 Thang 7.2026.docx
@@ -1,6 +1,6 @@
 
 <file path=word/document.xml><?xml version="1.0" encoding="utf-8"?>
-<w:document xmlns:wpc="http://schemas.microsoft.com/office/word/2010/wordprocessingCanvas" xmlns:cx="http://schemas.microsoft.com/office/drawing/2014/chartex" xmlns:cx1="http://schemas.microsoft.com/office/drawing/2015/9/8/chartex" xmlns:cx2="http://schemas.microsoft.com/office/drawing/2015/10/21/chartex" xmlns:cx3="http://schemas.microsoft.com/office/drawing/2016/5/9/chartex" xmlns:cx4="http://schemas.microsoft.com/office/drawing/2016/5/10/chartex" xmlns:cx5="http://schemas.microsoft.com/office/drawing/2016/5/11/chartex" xmlns:cx6="http://schemas.microsoft.com/office/drawing/2016/5/12/chartex" xmlns:cx7="http://schemas.microsoft.com/office/drawing/2016/5/13/chartex" xmlns:cx8="http://schemas.microsoft.com/office/drawing/2016/5/14/chartex" xmlns:mc="http://schemas.openxmlformats.org/markup-compatibility/2006" xmlns:aink="http://schemas.microsoft.com/office/drawing/2016/ink" xmlns:am3d="http://schemas.microsoft.com/office/drawing/2017/model3d" xmlns:o="urn:schemas-microsoft-com:office:office" xmlns:oel="http://schemas.microsoft.com/office/2019/extlst" xmlns:r="http://schemas.openxmlformats.org/officeDocument/2006/relationships" xmlns:m="http://schemas.openxmlformats.org/officeDocument/2006/math" xmlns:v="urn:schemas-microsoft-com:vml" xmlns:wp14="http://schemas.microsoft.com/office/word/2010/wordprocessingDrawing" xmlns:wp="http://schemas.openxmlformats.org/drawingml/2006/wordprocessingDrawing" xmlns:w10="urn:schemas-microsoft-com:office:word" xmlns:w="http://schemas.openxmlformats.org/wordprocessingml/2006/main" xmlns:w14="http://schemas.microsoft.com/office/word/2010/wordml" xmlns:w15="http://schemas.microsoft.com/office/word/2012/wordml" xmlns:w16cex="http://schemas.microsoft.com/office/word/2018/wordml/cex" xmlns:w16cid="http://schemas.microsoft.com/office/word/2016/wordml/cid" xmlns:w16="http://schemas.microsoft.com/office/word/2018/wordml" xmlns:w16du="http://schemas.microsoft.com/office/word/2023/wordml/word16du" xmlns:w16sdtdh="http://schemas.microsoft.com/office/word/2020/wordml/sdtdatahash" xmlns:w16sdtfl="http://schemas.microsoft.com/office/word/2024/wordml/sdtformatlock" xmlns:w16se="http://schemas.microsoft.com/office/word/2015/wordml/symex" xmlns:wpg="http://schemas.microsoft.com/office/word/2010/wordprocessingGroup" xmlns:wpi="http://schemas.microsoft.com/office/word/2010/wordprocessingInk" xmlns:wne="http://schemas.microsoft.com/office/word/2006/wordml" xmlns:wps="http://schemas.microsoft.com/office/word/2010/wordprocessingShape" mc:Ignorable="w14 w15 w16se w16cid w16 w16cex w16sdtdh w16sdtfl w16du wp14">
+<w:document xmlns:wpc="http://schemas.microsoft.com/office/word/2010/wordprocessingCanvas" xmlns:cx="http://schemas.microsoft.com/office/drawing/2014/chartex" xmlns:cx1="http://schemas.microsoft.com/office/drawing/2015/9/8/chartex" xmlns:cx2="http://schemas.microsoft.com/office/drawing/2015/10/21/chartex" xmlns:cx3="http://schemas.microsoft.com/office/drawing/2016/5/9/chartex" xmlns:cx4="http://schemas.microsoft.com/office/drawing/2016/5/10/chartex" xmlns:cx5="http://schemas.microsoft.com/office/drawing/2016/5/11/chartex" xmlns:cx6="http://schemas.microsoft.com/office/drawing/2016/5/12/chartex" xmlns:cx7="http://schemas.microsoft.com/office/drawing/2016/5/13/chartex" xmlns:cx8="http://schemas.microsoft.com/office/drawing/2016/5/14/chartex" xmlns:mc="http://schemas.openxmlformats.org/markup-compatibility/2006" xmlns:aink="http://schemas.microsoft.com/office/drawing/2016/ink" xmlns:am3d="http://schemas.microsoft.com/office/drawing/2017/model3d" xmlns:o="urn:schemas-microsoft-com:office:office" xmlns:oel="http://schemas.microsoft.com/office/2019/extlst" xmlns:r="http://schemas.openxmlformats.org/officeDocument/2006/relationships" xmlns:m="http://schemas.openxmlformats.org/officeDocument/2006/math" xmlns:v="urn:schemas-microsoft-com:vml" xmlns:wp14="http://schemas.microsoft.com/office/word/2010/wordprocessingDrawing" xmlns:wp="http://schemas.openxmlformats.org/drawingml/2006/wordprocessingDrawing" xmlns:w10="urn:schemas-microsoft-com:office:word" xmlns:w="http://schemas.openxmlformats.org/wordprocessingml/2006/main" xmlns:w14="http://schemas.microsoft.com/office/word/2010/wordml" xmlns:w15="http://schemas.microsoft.com/office/word/2012/wordml" xmlns:w16cei="http://schemas.microsoft.com/office/word/2026/wordml/cei" xmlns:w16cex="http://schemas.microsoft.com/office/word/2018/wordml/cex" xmlns:w16cid="http://schemas.microsoft.com/office/word/2016/wordml/cid" xmlns:w16="http://schemas.microsoft.com/office/word/2018/wordml" xmlns:w16du="http://schemas.microsoft.com/office/word/2023/wordml/word16du" xmlns:w16sdtdh="http://schemas.microsoft.com/office/word/2020/wordml/sdtdatahash" xmlns:w16sdtfl="http://schemas.microsoft.com/office/word/2024/wordml/sdtformatlock" xmlns:w16se="http://schemas.microsoft.com/office/word/2015/wordml/symex" xmlns:wpg="http://schemas.microsoft.com/office/word/2010/wordprocessingGroup" xmlns:wpi="http://schemas.microsoft.com/office/word/2010/wordprocessingInk" xmlns:wne="http://schemas.microsoft.com/office/word/2006/wordml" xmlns:wps="http://schemas.microsoft.com/office/word/2010/wordprocessingShape" mc:Ignorable="w14 w15 w16se w16cid w16 w16cex w16sdtdh w16sdtfl w16du wp14">
   <w:body>
     <w:p>
       <w:pPr>
@@ -706,6 +706,7 @@
           <w:sz w:val="26"/>
           <w:szCs w:val="26"/>
         </w:rPr>
+        <w:lastRenderedPageBreak/>
         <w:t>Bài học góp phần hình thành, phát triển ở HS năng lực chung và một số năng lực đặc thù khác như: Tự chủ và tực học, giải quyết vấn đề và sáng tạo, giao tiếp và hợp tác, ngôn ngữ, khoa học (tìm hiểu tự nhiên, xã hội) … thông qua một số biểu hiện như:</w:t>
       </w:r>
       <w:r>
@@ -728,18 +729,7 @@
           <w:sz w:val="26"/>
           <w:szCs w:val="26"/>
         </w:rPr>
-        <w:t xml:space="preserve">Biết được </w:t>
-      </w:r>
-      <w:r>
-        <w:rPr>
-          <w:i/>
-          <w:iCs/>
-          <w:color w:val="000000"/>
-          <w:sz w:val="26"/>
-          <w:szCs w:val="26"/>
-        </w:rPr>
-        <w:lastRenderedPageBreak/>
-        <w:t>nhiều sản phẩm trong đời sống có biểu hiện kiểu nét khác nhau và được tạo bằng những nguyên vật liệu như mây, tre, sắt, thép…</w:t>
+        <w:t>Biết được nhiều sản phẩm trong đời sống có biểu hiện kiểu nét khác nhau và được tạo bằng những nguyên vật liệu như mây, tre, sắt, thép…</w:t>
       </w:r>
     </w:p>
     <w:p>
@@ -1790,6 +1780,7 @@
                 <w:sz w:val="26"/>
                 <w:szCs w:val="26"/>
               </w:rPr>
+              <w:lastRenderedPageBreak/>
               <w:t>*Cách tiến hành: Hoạt động cá nhân – nhóm - cả lớp</w:t>
             </w:r>
           </w:p>
@@ -1820,6 +1811,7 @@
                 <w:sz w:val="26"/>
                 <w:szCs w:val="26"/>
               </w:rPr>
+              <w:lastRenderedPageBreak/>
               <w:t>- GV.........</w:t>
             </w:r>
           </w:p>
@@ -1921,7 +1913,6 @@
                 <w:sz w:val="26"/>
                 <w:szCs w:val="26"/>
               </w:rPr>
-              <w:lastRenderedPageBreak/>
               <w:t>3.2  [Ghi tên hoạt động]</w:t>
             </w:r>
             <w:r>
@@ -2323,6 +2314,7 @@
           <w:sz w:val="26"/>
           <w:szCs w:val="26"/>
         </w:rPr>
+        <w:lastRenderedPageBreak/>
         <w:t>+ Nội dung thể hiện rõ hoạt động của thầy - trò, hình thức tổ chức, nội dung, phương pháp, đồ dùng dạy học, dự kiến thời gian cho từng hoạt động, chốt bài (hoặc chốt hoạt động) bằng hệ thống câu hỏi và nội dung kiến thức,.... Cần đưa câu hỏi hoặc bài tập phát triển năng lực phù hợp với học sinh của lớp.</w:t>
       </w:r>
     </w:p>
@@ -2350,16 +2342,17 @@
       <w:headerReference w:type="default" r:id="rId8"/>
       <w:footerReference w:type="default" r:id="rId9"/>
       <w:pgSz w:w="11907" w:h="16840"/>
-      <w:pgMar w:top="816" w:right="1134" w:bottom="1134" w:left="1418" w:header="295" w:footer="108" w:gutter="0"/>
+      <w:pgMar w:top="816" w:right="1134" w:bottom="1134" w:left="1418" w:header="0" w:footer="0" w:gutter="0"/>
       <w:pgNumType w:start="1"/>
       <w:cols w:space="720"/>
+      <w:docGrid w:linePitch="381"/>
     </w:sectPr>
   </w:body>
 </w:document>
 </file>
 
 <file path=word/endnotes.xml><?xml version="1.0" encoding="utf-8"?>
-<w:endnotes xmlns:wpc="http://schemas.microsoft.com/office/word/2010/wordprocessingCanvas" xmlns:cx="http://schemas.microsoft.com/office/drawing/2014/chartex" xmlns:cx1="http://schemas.microsoft.com/office/drawing/2015/9/8/chartex" xmlns:cx2="http://schemas.microsoft.com/office/drawing/2015/10/21/chartex" xmlns:cx3="http://schemas.microsoft.com/office/drawing/2016/5/9/chartex" xmlns:cx4="http://schemas.microsoft.com/office/drawing/2016/5/10/chartex" xmlns:cx5="http://schemas.microsoft.com/office/drawing/2016/5/11/chartex" xmlns:cx6="http://schemas.microsoft.com/office/drawing/2016/5/12/chartex" xmlns:cx7="http://schemas.microsoft.com/office/drawing/2016/5/13/chartex" xmlns:cx8="http://schemas.microsoft.com/office/drawing/2016/5/14/chartex" xmlns:mc="http://schemas.openxmlformats.org/markup-compatibility/2006" xmlns:aink="http://schemas.microsoft.com/office/drawing/2016/ink" xmlns:am3d="http://schemas.microsoft.com/office/drawing/2017/model3d" xmlns:o="urn:schemas-microsoft-com:office:office" xmlns:oel="http://schemas.microsoft.com/office/2019/extlst" xmlns:r="http://schemas.openxmlformats.org/officeDocument/2006/relationships" xmlns:m="http://schemas.openxmlformats.org/officeDocument/2006/math" xmlns:v="urn:schemas-microsoft-com:vml" xmlns:wp14="http://schemas.microsoft.com/office/word/2010/wordprocessingDrawing" xmlns:wp="http://schemas.openxmlformats.org/drawingml/2006/wordprocessingDrawing" xmlns:w10="urn:schemas-microsoft-com:office:word" xmlns:w="http://schemas.openxmlformats.org/wordprocessingml/2006/main" xmlns:w14="http://schemas.microsoft.com/office/word/2010/wordml" xmlns:w15="http://schemas.microsoft.com/office/word/2012/wordml" xmlns:w16cex="http://schemas.microsoft.com/office/word/2018/wordml/cex" xmlns:w16cid="http://schemas.microsoft.com/office/word/2016/wordml/cid" xmlns:w16="http://schemas.microsoft.com/office/word/2018/wordml" xmlns:w16du="http://schemas.microsoft.com/office/word/2023/wordml/word16du" xmlns:w16sdtdh="http://schemas.microsoft.com/office/word/2020/wordml/sdtdatahash" xmlns:w16sdtfl="http://schemas.microsoft.com/office/word/2024/wordml/sdtformatlock" xmlns:w16se="http://schemas.microsoft.com/office/word/2015/wordml/symex" xmlns:wpg="http://schemas.microsoft.com/office/word/2010/wordprocessingGroup" xmlns:wpi="http://schemas.microsoft.com/office/word/2010/wordprocessingInk" xmlns:wne="http://schemas.microsoft.com/office/word/2006/wordml" xmlns:wps="http://schemas.microsoft.com/office/word/2010/wordprocessingShape" mc:Ignorable="w14 w15 w16se w16cid w16 w16cex w16sdtdh w16sdtfl w16du wp14">
+<w:endnotes xmlns:wpc="http://schemas.microsoft.com/office/word/2010/wordprocessingCanvas" xmlns:cx="http://schemas.microsoft.com/office/drawing/2014/chartex" xmlns:cx1="http://schemas.microsoft.com/office/drawing/2015/9/8/chartex" xmlns:cx2="http://schemas.microsoft.com/office/drawing/2015/10/21/chartex" xmlns:cx3="http://schemas.microsoft.com/office/drawing/2016/5/9/chartex" xmlns:cx4="http://schemas.microsoft.com/office/drawing/2016/5/10/chartex" xmlns:cx5="http://schemas.microsoft.com/office/drawing/2016/5/11/chartex" xmlns:cx6="http://schemas.microsoft.com/office/drawing/2016/5/12/chartex" xmlns:cx7="http://schemas.microsoft.com/office/drawing/2016/5/13/chartex" xmlns:cx8="http://schemas.microsoft.com/office/drawing/2016/5/14/chartex" xmlns:mc="http://schemas.openxmlformats.org/markup-compatibility/2006" xmlns:aink="http://schemas.microsoft.com/office/drawing/2016/ink" xmlns:am3d="http://schemas.microsoft.com/office/drawing/2017/model3d" xmlns:o="urn:schemas-microsoft-com:office:office" xmlns:oel="http://schemas.microsoft.com/office/2019/extlst" xmlns:r="http://schemas.openxmlformats.org/officeDocument/2006/relationships" xmlns:m="http://schemas.openxmlformats.org/officeDocument/2006/math" xmlns:v="urn:schemas-microsoft-com:vml" xmlns:wp14="http://schemas.microsoft.com/office/word/2010/wordprocessingDrawing" xmlns:wp="http://schemas.openxmlformats.org/drawingml/2006/wordprocessingDrawing" xmlns:w10="urn:schemas-microsoft-com:office:word" xmlns:w="http://schemas.openxmlformats.org/wordprocessingml/2006/main" xmlns:w14="http://schemas.microsoft.com/office/word/2010/wordml" xmlns:w15="http://schemas.microsoft.com/office/word/2012/wordml" xmlns:w16cei="http://schemas.microsoft.com/office/word/2026/wordml/cei" xmlns:w16cex="http://schemas.microsoft.com/office/word/2018/wordml/cex" xmlns:w16cid="http://schemas.microsoft.com/office/word/2016/wordml/cid" xmlns:w16="http://schemas.microsoft.com/office/word/2018/wordml" xmlns:w16du="http://schemas.microsoft.com/office/word/2023/wordml/word16du" xmlns:w16sdtdh="http://schemas.microsoft.com/office/word/2020/wordml/sdtdatahash" xmlns:w16sdtfl="http://schemas.microsoft.com/office/word/2024/wordml/sdtformatlock" xmlns:w16se="http://schemas.microsoft.com/office/word/2015/wordml/symex" xmlns:wpg="http://schemas.microsoft.com/office/word/2010/wordprocessingGroup" xmlns:wpi="http://schemas.microsoft.com/office/word/2010/wordprocessingInk" xmlns:wne="http://schemas.microsoft.com/office/word/2006/wordml" xmlns:wps="http://schemas.microsoft.com/office/word/2010/wordprocessingShape" mc:Ignorable="w14 w15 w16se w16cid w16 w16cex w16sdtdh w16sdtfl w16du wp14">
   <w:endnote w:type="separator" w:id="-1">
     <w:p>
       <w:r>
@@ -2378,28 +2371,7 @@
 </file>
 
 <file path=word/footer1.xml><?xml version="1.0" encoding="utf-8"?>
-<w:ftr xmlns:wpc="http://schemas.microsoft.com/office/word/2010/wordprocessingCanvas" xmlns:cx="http://schemas.microsoft.com/office/drawing/2014/chartex" xmlns:cx1="http://schemas.microsoft.com/office/drawing/2015/9/8/chartex" xmlns:cx2="http://schemas.microsoft.com/office/drawing/2015/10/21/chartex" xmlns:cx3="http://schemas.microsoft.com/office/drawing/2016/5/9/chartex" xmlns:cx4="http://schemas.microsoft.com/office/drawing/2016/5/10/chartex" xmlns:cx5="http://schemas.microsoft.com/office/drawing/2016/5/11/chartex" xmlns:cx6="http://schemas.microsoft.com/office/drawing/2016/5/12/chartex" xmlns:cx7="http://schemas.microsoft.com/office/drawing/2016/5/13/chartex" xmlns:cx8="http://schemas.microsoft.com/office/drawing/2016/5/14/chartex" xmlns:mc="http://schemas.openxmlformats.org/markup-compatibility/2006" xmlns:aink="http://schemas.microsoft.com/office/drawing/2016/ink" xmlns:am3d="http://schemas.microsoft.com/office/drawing/2017/model3d" xmlns:o="urn:schemas-microsoft-com:office:office" xmlns:oel="http://schemas.microsoft.com/office/2019/extlst" xmlns:r="http://schemas.openxmlformats.org/officeDocument/2006/relationships" xmlns:m="http://schemas.openxmlformats.org/officeDocument/2006/math" xmlns:v="urn:schemas-microsoft-com:vml" xmlns:wp14="http://schemas.microsoft.com/office/word/2010/wordprocessingDrawing" xmlns:wp="http://schemas.openxmlformats.org/drawingml/2006/wordprocessingDrawing" xmlns:w10="urn:schemas-microsoft-com:office:word" xmlns:w="http://schemas.openxmlformats.org/wordprocessingml/2006/main" xmlns:w14="http://schemas.microsoft.com/office/word/2010/wordml" xmlns:w15="http://schemas.microsoft.com/office/word/2012/wordml" xmlns:w16cex="http://schemas.microsoft.com/office/word/2018/wordml/cex" xmlns:w16cid="http://schemas.microsoft.com/office/word/2016/wordml/cid" xmlns:w16="http://schemas.microsoft.com/office/word/2018/wordml" xmlns:w16du="http://schemas.microsoft.com/office/word/2023/wordml/word16du" xmlns:w16sdtdh="http://schemas.microsoft.com/office/word/2020/wordml/sdtdatahash" xmlns:w16sdtfl="http://schemas.microsoft.com/office/word/2024/wordml/sdtformatlock" xmlns:w16se="http://schemas.microsoft.com/office/word/2015/wordml/symex" xmlns:wpg="http://schemas.microsoft.com/office/word/2010/wordprocessingGroup" xmlns:wpi="http://schemas.microsoft.com/office/word/2010/wordprocessingInk" xmlns:wne="http://schemas.microsoft.com/office/word/2006/wordml" xmlns:wps="http://schemas.microsoft.com/office/word/2010/wordprocessingShape" mc:Ignorable="w14 w15 w16se w16cid w16 w16cex w16sdtdh w16sdtfl w16du wp14">
-  <w:p>
-    <w:pPr>
-      <w:pBdr>
-        <w:top w:val="nil"/>
-        <w:left w:val="nil"/>
-        <w:bottom w:val="nil"/>
-        <w:right w:val="nil"/>
-        <w:between w:val="nil"/>
-      </w:pBdr>
-      <w:tabs>
-        <w:tab w:val="center" w:pos="4320"/>
-        <w:tab w:val="right" w:pos="8640"/>
-      </w:tabs>
-      <w:jc w:val="center"/>
-      <w:rPr>
-        <w:color w:val="000000"/>
-        <w:sz w:val="24"/>
-        <w:szCs w:val="24"/>
-      </w:rPr>
-    </w:pPr>
-  </w:p>
+<w:ftr xmlns:wpc="http://schemas.microsoft.com/office/word/2010/wordprocessingCanvas" xmlns:cx="http://schemas.microsoft.com/office/drawing/2014/chartex" xmlns:cx1="http://schemas.microsoft.com/office/drawing/2015/9/8/chartex" xmlns:cx2="http://schemas.microsoft.com/office/drawing/2015/10/21/chartex" xmlns:cx3="http://schemas.microsoft.com/office/drawing/2016/5/9/chartex" xmlns:cx4="http://schemas.microsoft.com/office/drawing/2016/5/10/chartex" xmlns:cx5="http://schemas.microsoft.com/office/drawing/2016/5/11/chartex" xmlns:cx6="http://schemas.microsoft.com/office/drawing/2016/5/12/chartex" xmlns:cx7="http://schemas.microsoft.com/office/drawing/2016/5/13/chartex" xmlns:cx8="http://schemas.microsoft.com/office/drawing/2016/5/14/chartex" xmlns:mc="http://schemas.openxmlformats.org/markup-compatibility/2006" xmlns:aink="http://schemas.microsoft.com/office/drawing/2016/ink" xmlns:am3d="http://schemas.microsoft.com/office/drawing/2017/model3d" xmlns:o="urn:schemas-microsoft-com:office:office" xmlns:oel="http://schemas.microsoft.com/office/2019/extlst" xmlns:r="http://schemas.openxmlformats.org/officeDocument/2006/relationships" xmlns:m="http://schemas.openxmlformats.org/officeDocument/2006/math" xmlns:v="urn:schemas-microsoft-com:vml" xmlns:wp14="http://schemas.microsoft.com/office/word/2010/wordprocessingDrawing" xmlns:wp="http://schemas.openxmlformats.org/drawingml/2006/wordprocessingDrawing" xmlns:w10="urn:schemas-microsoft-com:office:word" xmlns:w="http://schemas.openxmlformats.org/wordprocessingml/2006/main" xmlns:w14="http://schemas.microsoft.com/office/word/2010/wordml" xmlns:w15="http://schemas.microsoft.com/office/word/2012/wordml" xmlns:w16cei="http://schemas.microsoft.com/office/word/2026/wordml/cei" xmlns:w16cex="http://schemas.microsoft.com/office/word/2018/wordml/cex" xmlns:w16cid="http://schemas.microsoft.com/office/word/2016/wordml/cid" xmlns:w16="http://schemas.microsoft.com/office/word/2018/wordml" xmlns:w16du="http://schemas.microsoft.com/office/word/2023/wordml/word16du" xmlns:w16sdtdh="http://schemas.microsoft.com/office/word/2020/wordml/sdtdatahash" xmlns:w16sdtfl="http://schemas.microsoft.com/office/word/2024/wordml/sdtformatlock" xmlns:w16se="http://schemas.microsoft.com/office/word/2015/wordml/symex" xmlns:wpg="http://schemas.microsoft.com/office/word/2010/wordprocessingGroup" xmlns:wpi="http://schemas.microsoft.com/office/word/2010/wordprocessingInk" xmlns:wne="http://schemas.microsoft.com/office/word/2006/wordml" xmlns:wps="http://schemas.microsoft.com/office/word/2010/wordprocessingShape" mc:Ignorable="w14 w15 w16se w16cid w16 w16cex w16sdtdh w16sdtfl w16du wp14">
   <w:p>
     <w:pPr>
       <w:pBdr>
@@ -2419,12 +2391,74 @@
         <w:szCs w:val="24"/>
       </w:rPr>
     </w:pPr>
+    <w:r>
+      <w:rPr>
+        <w:noProof/>
+        <w:color w:val="000000"/>
+      </w:rPr>
+      <w:drawing>
+        <wp:anchor distT="0" distB="0" distL="114300" distR="114300" simplePos="0" relativeHeight="251658240" behindDoc="0" locked="0" layoutInCell="1" allowOverlap="1" wp14:anchorId="620972C5" wp14:editId="42F0431A">
+          <wp:simplePos x="0" y="0"/>
+          <wp:positionH relativeFrom="margin">
+            <wp:posOffset>90170</wp:posOffset>
+          </wp:positionH>
+          <wp:positionV relativeFrom="paragraph">
+            <wp:posOffset>65405</wp:posOffset>
+          </wp:positionV>
+          <wp:extent cx="5940425" cy="727075"/>
+          <wp:effectExtent l="0" t="0" r="3175" b="0"/>
+          <wp:wrapSquare wrapText="bothSides"/>
+          <wp:docPr id="1675536781" name="image2.png" descr="Artboard 3Tiêu đề giấy"/>
+          <wp:cNvGraphicFramePr/>
+          <a:graphic xmlns:a="http://schemas.openxmlformats.org/drawingml/2006/main">
+            <a:graphicData uri="http://schemas.openxmlformats.org/drawingml/2006/picture">
+              <pic:pic xmlns:pic="http://schemas.openxmlformats.org/drawingml/2006/picture">
+                <pic:nvPicPr>
+                  <pic:cNvPr id="0" name="image2.png" descr="Artboard 3Tiêu đề giấy"/>
+                  <pic:cNvPicPr preferRelativeResize="0"/>
+                </pic:nvPicPr>
+                <pic:blipFill rotWithShape="1">
+                  <a:blip r:embed="rId1">
+                    <a:extLst>
+                      <a:ext uri="{28A0092B-C50C-407E-A947-70E740481C1C}">
+                        <a14:useLocalDpi xmlns:a14="http://schemas.microsoft.com/office/drawing/2010/main" val="0"/>
+                      </a:ext>
+                    </a:extLst>
+                  </a:blip>
+                  <a:srcRect t="9258" b="18101"/>
+                  <a:stretch>
+                    <a:fillRect/>
+                  </a:stretch>
+                </pic:blipFill>
+                <pic:spPr bwMode="auto">
+                  <a:xfrm>
+                    <a:off x="0" y="0"/>
+                    <a:ext cx="5940425" cy="727075"/>
+                  </a:xfrm>
+                  <a:prstGeom prst="rect">
+                    <a:avLst/>
+                  </a:prstGeom>
+                  <a:ln>
+                    <a:noFill/>
+                  </a:ln>
+                  <a:extLst>
+                    <a:ext uri="{53640926-AAD7-44D8-BBD7-CCE9431645EC}">
+                      <a14:shadowObscured xmlns:a14="http://schemas.microsoft.com/office/drawing/2010/main"/>
+                    </a:ext>
+                  </a:extLst>
+                </pic:spPr>
+              </pic:pic>
+            </a:graphicData>
+          </a:graphic>
+        </wp:anchor>
+      </w:drawing>
+    </w:r>
   </w:p>
 </w:ftr>
 </file>
 
 <file path=word/footnotes.xml><?xml version="1.0" encoding="utf-8"?>
-<w:footnotes xmlns:wpc="http://schemas.microsoft.com/office/word/2010/wordprocessingCanvas" xmlns:cx="http://schemas.microsoft.com/office/drawing/2014/chartex" xmlns:cx1="http://schemas.microsoft.com/office/drawing/2015/9/8/chartex" xmlns:cx2="http://schemas.microsoft.com/office/drawing/2015/10/21/chartex" xmlns:cx3="http://schemas.microsoft.com/office/drawing/2016/5/9/chartex" xmlns:cx4="http://schemas.microsoft.com/office/drawing/2016/5/10/chartex" xmlns:cx5="http://schemas.microsoft.com/office/drawing/2016/5/11/chartex" xmlns:cx6="http://schemas.microsoft.com/office/drawing/2016/5/12/chartex" xmlns:cx7="http://schemas.microsoft.com/office/drawing/2016/5/13/chartex" xmlns:cx8="http://schemas.microsoft.com/office/drawing/2016/5/14/chartex" xmlns:mc="http://schemas.openxmlformats.org/markup-compatibility/2006" xmlns:aink="http://schemas.microsoft.com/office/drawing/2016/ink" xmlns:am3d="http://schemas.microsoft.com/office/drawing/2017/model3d" xmlns:o="urn:schemas-microsoft-com:office:office" xmlns:oel="http://schemas.microsoft.com/office/2019/extlst" xmlns:r="http://schemas.openxmlformats.org/officeDocument/2006/relationships" xmlns:m="http://schemas.openxmlformats.org/officeDocument/2006/math" xmlns:v="urn:schemas-microsoft-com:vml" xmlns:wp14="http://schemas.microsoft.com/office/word/2010/wordprocessingDrawing" xmlns:wp="http://schemas.openxmlformats.org/drawingml/2006/wordprocessingDrawing" xmlns:w10="urn:schemas-microsoft-com:office:word" xmlns:w="http://schemas.openxmlformats.org/wordprocessingml/2006/main" xmlns:w14="http://schemas.microsoft.com/office/word/2010/wordml" xmlns:w15="http://schemas.microsoft.com/office/word/2012/wordml" xmlns:w16cex="http://schemas.microsoft.com/office/word/2018/wordml/cex" xmlns:w16cid="http://schemas.microsoft.com/office/word/2016/wordml/cid" xmlns:w16="http://schemas.microsoft.com/office/word/2018/wordml" xmlns:w16du="http://schemas.microsoft.com/office/word/2023/wordml/word16du" xmlns:w16sdtdh="http://schemas.microsoft.com/office/word/2020/wordml/sdtdatahash" xmlns:w16sdtfl="http://schemas.microsoft.com/office/word/2024/wordml/sdtformatlock" xmlns:w16se="http://schemas.microsoft.com/office/word/2015/wordml/symex" xmlns:wpg="http://schemas.microsoft.com/office/word/2010/wordprocessingGroup" xmlns:wpi="http://schemas.microsoft.com/office/word/2010/wordprocessingInk" xmlns:wne="http://schemas.microsoft.com/office/word/2006/wordml" xmlns:wps="http://schemas.microsoft.com/office/word/2010/wordprocessingShape" mc:Ignorable="w14 w15 w16se w16cid w16 w16cex w16sdtdh w16sdtfl w16du wp14">
+<w:footnotes xmlns:wpc="http://schemas.microsoft.com/office/word/2010/wordprocessingCanvas" xmlns:cx="http://schemas.microsoft.com/office/drawing/2014/chartex" xmlns:cx1="http://schemas.microsoft.com/office/drawing/2015/9/8/chartex" xmlns:cx2="http://schemas.microsoft.com/office/drawing/2015/10/21/chartex" xmlns:cx3="http://schemas.microsoft.com/office/drawing/2016/5/9/chartex" xmlns:cx4="http://schemas.microsoft.com/office/drawing/2016/5/10/chartex" xmlns:cx5="http://schemas.microsoft.com/office/drawing/2016/5/11/chartex" xmlns:cx6="http://schemas.microsoft.com/office/drawing/2016/5/12/chartex" xmlns:cx7="http://schemas.microsoft.com/office/drawing/2016/5/13/chartex" xmlns:cx8="http://schemas.microsoft.com/office/drawing/2016/5/14/chartex" xmlns:mc="http://schemas.openxmlformats.org/markup-compatibility/2006" xmlns:aink="http://schemas.microsoft.com/office/drawing/2016/ink" xmlns:am3d="http://schemas.microsoft.com/office/drawing/2017/model3d" xmlns:o="urn:schemas-microsoft-com:office:office" xmlns:oel="http://schemas.microsoft.com/office/2019/extlst" xmlns:r="http://schemas.openxmlformats.org/officeDocument/2006/relationships" xmlns:m="http://schemas.openxmlformats.org/officeDocument/2006/math" xmlns:v="urn:schemas-microsoft-com:vml" xmlns:wp14="http://schemas.microsoft.com/office/word/2010/wordprocessingDrawing" xmlns:wp="http://schemas.openxmlformats.org/drawingml/2006/wordprocessingDrawing" xmlns:w10="urn:schemas-microsoft-com:office:word" xmlns:w="http://schemas.openxmlformats.org/wordprocessingml/2006/main" xmlns:w14="http://schemas.microsoft.com/office/word/2010/wordml" xmlns:w15="http://schemas.microsoft.com/office/word/2012/wordml" xmlns:w16cei="http://schemas.microsoft.com/office/word/2026/wordml/cei" xmlns:w16cex="http://schemas.microsoft.com/office/word/2018/wordml/cex" xmlns:w16cid="http://schemas.microsoft.com/office/word/2016/wordml/cid" xmlns:w16="http://schemas.microsoft.com/office/word/2018/wordml" xmlns:w16du="http://schemas.microsoft.com/office/word/2023/wordml/word16du" xmlns:w16sdtdh="http://schemas.microsoft.com/office/word/2020/wordml/sdtdatahash" xmlns:w16sdtfl="http://schemas.microsoft.com/office/word/2024/wordml/sdtformatlock" xmlns:w16se="http://schemas.microsoft.com/office/word/2015/wordml/symex" xmlns:wpg="http://schemas.microsoft.com/office/word/2010/wordprocessingGroup" xmlns:wpi="http://schemas.microsoft.com/office/word/2010/wordprocessingInk" xmlns:wne="http://schemas.microsoft.com/office/word/2006/wordml" xmlns:wps="http://schemas.microsoft.com/office/word/2010/wordprocessingShape" mc:Ignorable="w14 w15 w16se w16cid w16 w16cex w16sdtdh w16sdtfl w16du wp14">
   <w:footnote w:type="separator" w:id="-1">
     <w:p>
       <w:r>
@@ -2443,7 +2477,7 @@
 </file>
 
 <file path=word/header1.xml><?xml version="1.0" encoding="utf-8"?>
-<w:hdr xmlns:wpc="http://schemas.microsoft.com/office/word/2010/wordprocessingCanvas" xmlns:cx="http://schemas.microsoft.com/office/drawing/2014/chartex" xmlns:cx1="http://schemas.microsoft.com/office/drawing/2015/9/8/chartex" xmlns:cx2="http://schemas.microsoft.com/office/drawing/2015/10/21/chartex" xmlns:cx3="http://schemas.microsoft.com/office/drawing/2016/5/9/chartex" xmlns:cx4="http://schemas.microsoft.com/office/drawing/2016/5/10/chartex" xmlns:cx5="http://schemas.microsoft.com/office/drawing/2016/5/11/chartex" xmlns:cx6="http://schemas.microsoft.com/office/drawing/2016/5/12/chartex" xmlns:cx7="http://schemas.microsoft.com/office/drawing/2016/5/13/chartex" xmlns:cx8="http://schemas.microsoft.com/office/drawing/2016/5/14/chartex" xmlns:mc="http://schemas.openxmlformats.org/markup-compatibility/2006" xmlns:aink="http://schemas.microsoft.com/office/drawing/2016/ink" xmlns:am3d="http://schemas.microsoft.com/office/drawing/2017/model3d" xmlns:o="urn:schemas-microsoft-com:office:office" xmlns:oel="http://schemas.microsoft.com/office/2019/extlst" xmlns:r="http://schemas.openxmlformats.org/officeDocument/2006/relationships" xmlns:m="http://schemas.openxmlformats.org/officeDocument/2006/math" xmlns:v="urn:schemas-microsoft-com:vml" xmlns:wp14="http://schemas.microsoft.com/office/word/2010/wordprocessingDrawing" xmlns:wp="http://schemas.openxmlformats.org/drawingml/2006/wordprocessingDrawing" xmlns:w10="urn:schemas-microsoft-com:office:word" xmlns:w="http://schemas.openxmlformats.org/wordprocessingml/2006/main" xmlns:w14="http://schemas.microsoft.com/office/word/2010/wordml" xmlns:w15="http://schemas.microsoft.com/office/word/2012/wordml" xmlns:w16cex="http://schemas.microsoft.com/office/word/2018/wordml/cex" xmlns:w16cid="http://schemas.microsoft.com/office/word/2016/wordml/cid" xmlns:w16="http://schemas.microsoft.com/office/word/2018/wordml" xmlns:w16du="http://schemas.microsoft.com/office/word/2023/wordml/word16du" xmlns:w16sdtdh="http://schemas.microsoft.com/office/word/2020/wordml/sdtdatahash" xmlns:w16sdtfl="http://schemas.microsoft.com/office/word/2024/wordml/sdtformatlock" xmlns:w16se="http://schemas.microsoft.com/office/word/2015/wordml/symex" xmlns:wpg="http://schemas.microsoft.com/office/word/2010/wordprocessingGroup" xmlns:wpi="http://schemas.microsoft.com/office/word/2010/wordprocessingInk" xmlns:wne="http://schemas.microsoft.com/office/word/2006/wordml" xmlns:wps="http://schemas.microsoft.com/office/word/2010/wordprocessingShape" mc:Ignorable="w14 w15 w16se w16cid w16 w16cex w16sdtdh w16sdtfl w16du wp14">
+<w:hdr xmlns:wpc="http://schemas.microsoft.com/office/word/2010/wordprocessingCanvas" xmlns:cx="http://schemas.microsoft.com/office/drawing/2014/chartex" xmlns:cx1="http://schemas.microsoft.com/office/drawing/2015/9/8/chartex" xmlns:cx2="http://schemas.microsoft.com/office/drawing/2015/10/21/chartex" xmlns:cx3="http://schemas.microsoft.com/office/drawing/2016/5/9/chartex" xmlns:cx4="http://schemas.microsoft.com/office/drawing/2016/5/10/chartex" xmlns:cx5="http://schemas.microsoft.com/office/drawing/2016/5/11/chartex" xmlns:cx6="http://schemas.microsoft.com/office/drawing/2016/5/12/chartex" xmlns:cx7="http://schemas.microsoft.com/office/drawing/2016/5/13/chartex" xmlns:cx8="http://schemas.microsoft.com/office/drawing/2016/5/14/chartex" xmlns:mc="http://schemas.openxmlformats.org/markup-compatibility/2006" xmlns:aink="http://schemas.microsoft.com/office/drawing/2016/ink" xmlns:am3d="http://schemas.microsoft.com/office/drawing/2017/model3d" xmlns:o="urn:schemas-microsoft-com:office:office" xmlns:oel="http://schemas.microsoft.com/office/2019/extlst" xmlns:r="http://schemas.openxmlformats.org/officeDocument/2006/relationships" xmlns:m="http://schemas.openxmlformats.org/officeDocument/2006/math" xmlns:v="urn:schemas-microsoft-com:vml" xmlns:wp14="http://schemas.microsoft.com/office/word/2010/wordprocessingDrawing" xmlns:wp="http://schemas.openxmlformats.org/drawingml/2006/wordprocessingDrawing" xmlns:w10="urn:schemas-microsoft-com:office:word" xmlns:w="http://schemas.openxmlformats.org/wordprocessingml/2006/main" xmlns:w14="http://schemas.microsoft.com/office/word/2010/wordml" xmlns:w15="http://schemas.microsoft.com/office/word/2012/wordml" xmlns:w16cei="http://schemas.microsoft.com/office/word/2026/wordml/cei" xmlns:w16cex="http://schemas.microsoft.com/office/word/2018/wordml/cex" xmlns:w16cid="http://schemas.microsoft.com/office/word/2016/wordml/cid" xmlns:w16="http://schemas.microsoft.com/office/word/2018/wordml" xmlns:w16du="http://schemas.microsoft.com/office/word/2023/wordml/word16du" xmlns:w16sdtdh="http://schemas.microsoft.com/office/word/2020/wordml/sdtdatahash" xmlns:w16sdtfl="http://schemas.microsoft.com/office/word/2024/wordml/sdtformatlock" xmlns:w16se="http://schemas.microsoft.com/office/word/2015/wordml/symex" xmlns:wpg="http://schemas.microsoft.com/office/word/2010/wordprocessingGroup" xmlns:wpi="http://schemas.microsoft.com/office/word/2010/wordprocessingInk" xmlns:wne="http://schemas.microsoft.com/office/word/2006/wordml" xmlns:wps="http://schemas.microsoft.com/office/word/2010/wordprocessingShape" mc:Ignorable="w14 w15 w16se w16cid w16 w16cex w16sdtdh w16sdtfl w16du wp14">
   <w:p>
     <w:pPr>
       <w:pBdr>
@@ -2463,6 +2497,54 @@
         <w:u w:val="single"/>
       </w:rPr>
     </w:pPr>
+    <w:r>
+      <w:rPr>
+        <w:noProof/>
+        <w:color w:val="000000"/>
+      </w:rPr>
+      <w:drawing>
+        <wp:inline distT="0" distB="0" distL="0" distR="0" wp14:anchorId="3C2D8F01" wp14:editId="527CF57C">
+          <wp:extent cx="5938040" cy="716280"/>
+          <wp:effectExtent l="0" t="0" r="0" b="7620"/>
+          <wp:docPr id="879086213" name="image1.png" descr="Artboard 2Tiêu đề giấy"/>
+          <wp:cNvGraphicFramePr/>
+          <a:graphic xmlns:a="http://schemas.openxmlformats.org/drawingml/2006/main">
+            <a:graphicData uri="http://schemas.openxmlformats.org/drawingml/2006/picture">
+              <pic:pic xmlns:pic="http://schemas.openxmlformats.org/drawingml/2006/picture">
+                <pic:nvPicPr>
+                  <pic:cNvPr id="0" name="image1.png" descr="Artboard 2Tiêu đề giấy"/>
+                  <pic:cNvPicPr preferRelativeResize="0"/>
+                </pic:nvPicPr>
+                <pic:blipFill rotWithShape="1">
+                  <a:blip r:embed="rId1"/>
+                  <a:srcRect b="28426"/>
+                  <a:stretch>
+                    <a:fillRect/>
+                  </a:stretch>
+                </pic:blipFill>
+                <pic:spPr bwMode="auto">
+                  <a:xfrm>
+                    <a:off x="0" y="0"/>
+                    <a:ext cx="5940425" cy="716568"/>
+                  </a:xfrm>
+                  <a:prstGeom prst="rect">
+                    <a:avLst/>
+                  </a:prstGeom>
+                  <a:ln>
+                    <a:noFill/>
+                  </a:ln>
+                  <a:extLst>
+                    <a:ext uri="{53640926-AAD7-44D8-BBD7-CCE9431645EC}">
+                      <a14:shadowObscured xmlns:a14="http://schemas.microsoft.com/office/drawing/2010/main"/>
+                    </a:ext>
+                  </a:extLst>
+                </pic:spPr>
+              </pic:pic>
+            </a:graphicData>
+          </a:graphic>
+        </wp:inline>
+      </w:drawing>
+    </w:r>
     <w:r>
       <w:rPr>
         <w:color w:val="000000"/>
@@ -2537,7 +2619,7 @@
 </file>
 
 <file path=word/numbering.xml><?xml version="1.0" encoding="utf-8"?>
-<w:numbering xmlns:wpc="http://schemas.microsoft.com/office/word/2010/wordprocessingCanvas" xmlns:cx="http://schemas.microsoft.com/office/drawing/2014/chartex" xmlns:cx1="http://schemas.microsoft.com/office/drawing/2015/9/8/chartex" xmlns:cx2="http://schemas.microsoft.com/office/drawing/2015/10/21/chartex" xmlns:cx3="http://schemas.microsoft.com/office/drawing/2016/5/9/chartex" xmlns:cx4="http://schemas.microsoft.com/office/drawing/2016/5/10/chartex" xmlns:cx5="http://schemas.microsoft.com/office/drawing/2016/5/11/chartex" xmlns:cx6="http://schemas.microsoft.com/office/drawing/2016/5/12/chartex" xmlns:cx7="http://schemas.microsoft.com/office/drawing/2016/5/13/chartex" xmlns:cx8="http://schemas.microsoft.com/office/drawing/2016/5/14/chartex" xmlns:mc="http://schemas.openxmlformats.org/markup-compatibility/2006" xmlns:aink="http://schemas.microsoft.com/office/drawing/2016/ink" xmlns:am3d="http://schemas.microsoft.com/office/drawing/2017/model3d" xmlns:o="urn:schemas-microsoft-com:office:office" xmlns:oel="http://schemas.microsoft.com/office/2019/extlst" xmlns:r="http://schemas.openxmlformats.org/officeDocument/2006/relationships" xmlns:m="http://schemas.openxmlformats.org/officeDocument/2006/math" xmlns:v="urn:schemas-microsoft-com:vml" xmlns:wp14="http://schemas.microsoft.com/office/word/2010/wordprocessingDrawing" xmlns:wp="http://schemas.openxmlformats.org/drawingml/2006/wordprocessingDrawing" xmlns:w10="urn:schemas-microsoft-com:office:word" xmlns:w="http://schemas.openxmlformats.org/wordprocessingml/2006/main" xmlns:w14="http://schemas.microsoft.com/office/word/2010/wordml" xmlns:w15="http://schemas.microsoft.com/office/word/2012/wordml" xmlns:w16cex="http://schemas.microsoft.com/office/word/2018/wordml/cex" xmlns:w16cid="http://schemas.microsoft.com/office/word/2016/wordml/cid" xmlns:w16="http://schemas.microsoft.com/office/word/2018/wordml" xmlns:w16du="http://schemas.microsoft.com/office/word/2023/wordml/word16du" xmlns:w16sdtdh="http://schemas.microsoft.com/office/word/2020/wordml/sdtdatahash" xmlns:w16sdtfl="http://schemas.microsoft.com/office/word/2024/wordml/sdtformatlock" xmlns:w16se="http://schemas.microsoft.com/office/word/2015/wordml/symex" xmlns:wpg="http://schemas.microsoft.com/office/word/2010/wordprocessingGroup" xmlns:wpi="http://schemas.microsoft.com/office/word/2010/wordprocessingInk" xmlns:wne="http://schemas.microsoft.com/office/word/2006/wordml" xmlns:wps="http://schemas.microsoft.com/office/word/2010/wordprocessingShape" mc:Ignorable="w14 w15 w16se w16cid w16 w16cex w16sdtdh w16sdtfl w16du wp14">
+<w:numbering xmlns:wpc="http://schemas.microsoft.com/office/word/2010/wordprocessingCanvas" xmlns:cx="http://schemas.microsoft.com/office/drawing/2014/chartex" xmlns:cx1="http://schemas.microsoft.com/office/drawing/2015/9/8/chartex" xmlns:cx2="http://schemas.microsoft.com/office/drawing/2015/10/21/chartex" xmlns:cx3="http://schemas.microsoft.com/office/drawing/2016/5/9/chartex" xmlns:cx4="http://schemas.microsoft.com/office/drawing/2016/5/10/chartex" xmlns:cx5="http://schemas.microsoft.com/office/drawing/2016/5/11/chartex" xmlns:cx6="http://schemas.microsoft.com/office/drawing/2016/5/12/chartex" xmlns:cx7="http://schemas.microsoft.com/office/drawing/2016/5/13/chartex" xmlns:cx8="http://schemas.microsoft.com/office/drawing/2016/5/14/chartex" xmlns:mc="http://schemas.openxmlformats.org/markup-compatibility/2006" xmlns:aink="http://schemas.microsoft.com/office/drawing/2016/ink" xmlns:am3d="http://schemas.microsoft.com/office/drawing/2017/model3d" xmlns:o="urn:schemas-microsoft-com:office:office" xmlns:oel="http://schemas.microsoft.com/office/2019/extlst" xmlns:r="http://schemas.openxmlformats.org/officeDocument/2006/relationships" xmlns:m="http://schemas.openxmlformats.org/officeDocument/2006/math" xmlns:v="urn:schemas-microsoft-com:vml" xmlns:wp14="http://schemas.microsoft.com/office/word/2010/wordprocessingDrawing" xmlns:wp="http://schemas.openxmlformats.org/drawingml/2006/wordprocessingDrawing" xmlns:w10="urn:schemas-microsoft-com:office:word" xmlns:w="http://schemas.openxmlformats.org/wordprocessingml/2006/main" xmlns:w14="http://schemas.microsoft.com/office/word/2010/wordml" xmlns:w15="http://schemas.microsoft.com/office/word/2012/wordml" xmlns:w16cei="http://schemas.microsoft.com/office/word/2026/wordml/cei" xmlns:w16cex="http://schemas.microsoft.com/office/word/2018/wordml/cex" xmlns:w16cid="http://schemas.microsoft.com/office/word/2016/wordml/cid" xmlns:w16="http://schemas.microsoft.com/office/word/2018/wordml" xmlns:w16du="http://schemas.microsoft.com/office/word/2023/wordml/word16du" xmlns:w16sdtdh="http://schemas.microsoft.com/office/word/2020/wordml/sdtdatahash" xmlns:w16sdtfl="http://schemas.microsoft.com/office/word/2024/wordml/sdtformatlock" xmlns:w16se="http://schemas.microsoft.com/office/word/2015/wordml/symex" xmlns:wpg="http://schemas.microsoft.com/office/word/2010/wordprocessingGroup" xmlns:wpi="http://schemas.microsoft.com/office/word/2010/wordprocessingInk" xmlns:wne="http://schemas.microsoft.com/office/word/2006/wordml" xmlns:wps="http://schemas.microsoft.com/office/word/2010/wordprocessingShape" mc:Ignorable="w14 w15 w16se w16cid w16 w16cex w16sdtdh w16sdtfl w16du wp14">
   <w:abstractNum w:abstractNumId="0" w15:restartNumberingAfterBreak="0">
     <w:nsid w:val="059021DF"/>
     <w:multiLevelType w:val="multilevel"/>
@@ -3240,6 +3322,48 @@
       </w:tblCellMar>
     </w:tblPr>
   </w:style>
+  <w:style w:type="paragraph" w:styleId="Header">
+    <w:name w:val="header"/>
+    <w:basedOn w:val="Normal"/>
+    <w:link w:val="HeaderChar"/>
+    <w:uiPriority w:val="99"/>
+    <w:unhideWhenUsed/>
+    <w:rsid w:val="002C71F3"/>
+    <w:pPr>
+      <w:tabs>
+        <w:tab w:val="center" w:pos="4680"/>
+        <w:tab w:val="right" w:pos="9360"/>
+      </w:tabs>
+    </w:pPr>
+  </w:style>
+  <w:style w:type="character" w:customStyle="1" w:styleId="HeaderChar">
+    <w:name w:val="Header Char"/>
+    <w:basedOn w:val="DefaultParagraphFont"/>
+    <w:link w:val="Header"/>
+    <w:uiPriority w:val="99"/>
+    <w:rsid w:val="002C71F3"/>
+  </w:style>
+  <w:style w:type="paragraph" w:styleId="Footer">
+    <w:name w:val="footer"/>
+    <w:basedOn w:val="Normal"/>
+    <w:link w:val="FooterChar"/>
+    <w:uiPriority w:val="99"/>
+    <w:unhideWhenUsed/>
+    <w:rsid w:val="002C71F3"/>
+    <w:pPr>
+      <w:tabs>
+        <w:tab w:val="center" w:pos="4680"/>
+        <w:tab w:val="right" w:pos="9360"/>
+      </w:tabs>
+    </w:pPr>
+  </w:style>
+  <w:style w:type="character" w:customStyle="1" w:styleId="FooterChar">
+    <w:name w:val="Footer Char"/>
+    <w:basedOn w:val="DefaultParagraphFont"/>
+    <w:link w:val="Footer"/>
+    <w:uiPriority w:val="99"/>
+    <w:rsid w:val="002C71F3"/>
+  </w:style>
 </w:styles>
 </file>
 

</xml_diff>

<commit_message>
Tao lai toan bo KHBD Bai 1: Tien TH den Lop 8 - 2 luat rieng TH/THCS chuan template
</commit_message>
<xml_diff>
--- a/Hệ thống mẫu văn bản/Khung  giáo án Unigo 2026-2027 Thang 7.2026.docx
+++ b/Hệ thống mẫu văn bản/Khung  giáo án Unigo 2026-2027 Thang 7.2026.docx
@@ -13,15 +13,6 @@
           <w:szCs w:val="26"/>
         </w:rPr>
       </w:pPr>
-      <w:r>
-        <w:rPr>
-          <w:b/>
-          <w:bCs/>
-          <w:sz w:val="26"/>
-          <w:szCs w:val="26"/>
-        </w:rPr>
-        <w:t xml:space="preserve">                                                                                                                                                                                                                                                                                                                                                                            </w:t>
-      </w:r>
       <w:r>
         <w:rPr>
           <w:b/>
@@ -706,8 +697,18 @@
           <w:sz w:val="26"/>
           <w:szCs w:val="26"/>
         </w:rPr>
+        <w:t xml:space="preserve">Bài học góp phần hình thành, phát triển ở HS năng lực chung và một số năng lực đặc thù khác như: Tự chủ và tực học, giải quyết vấn đề và sáng tạo, giao tiếp và hợp tác, ngôn </w:t>
+      </w:r>
+      <w:r>
+        <w:rPr>
+          <w:i/>
+          <w:iCs/>
+          <w:color w:val="000000"/>
+          <w:sz w:val="26"/>
+          <w:szCs w:val="26"/>
+        </w:rPr>
         <w:lastRenderedPageBreak/>
-        <w:t>Bài học góp phần hình thành, phát triển ở HS năng lực chung và một số năng lực đặc thù khác như: Tự chủ và tực học, giải quyết vấn đề và sáng tạo, giao tiếp và hợp tác, ngôn ngữ, khoa học (tìm hiểu tự nhiên, xã hội) … thông qua một số biểu hiện như:</w:t>
+        <w:t>ngữ, khoa học (tìm hiểu tự nhiên, xã hội) … thông qua một số biểu hiện như:</w:t>
       </w:r>
       <w:r>
         <w:rPr>
@@ -1780,7 +1781,6 @@
                 <w:sz w:val="26"/>
                 <w:szCs w:val="26"/>
               </w:rPr>
-              <w:lastRenderedPageBreak/>
               <w:t>*Cách tiến hành: Hoạt động cá nhân – nhóm - cả lớp</w:t>
             </w:r>
           </w:p>

</xml_diff>